<commit_message>
develop: add basic modules to register users and do basic login: addresses, roles, auth, users
</commit_message>
<xml_diff>
--- a/documentacion/docs/Entidades del sistema v1.docx
+++ b/documentacion/docs/Entidades del sistema v1.docx
@@ -18,9 +18,11 @@
           <w:numId w:val="1"/>
         </w:numPr>
       </w:pPr>
+      <w:proofErr w:type="spellStart"/>
       <w:r>
         <w:t>User</w:t>
       </w:r>
+      <w:proofErr w:type="spellEnd"/>
     </w:p>
     <w:p>
       <w:pPr>
@@ -54,9 +56,11 @@
           <w:numId w:val="1"/>
         </w:numPr>
       </w:pPr>
+      <w:proofErr w:type="spellStart"/>
       <w:r>
         <w:t>FirstName</w:t>
       </w:r>
+      <w:proofErr w:type="spellEnd"/>
     </w:p>
     <w:p>
       <w:pPr>
@@ -90,57 +94,67 @@
           <w:numId w:val="1"/>
         </w:numPr>
       </w:pPr>
+      <w:proofErr w:type="spellStart"/>
       <w:r>
         <w:t>Password</w:t>
       </w:r>
-    </w:p>
-    <w:p>
-      <w:pPr>
-        <w:pStyle w:val="Prrafodelista"/>
-        <w:numPr>
-          <w:ilvl w:val="2"/>
-          <w:numId w:val="1"/>
-        </w:numPr>
-      </w:pPr>
+      <w:proofErr w:type="spellEnd"/>
+    </w:p>
+    <w:p>
+      <w:pPr>
+        <w:pStyle w:val="Prrafodelista"/>
+        <w:numPr>
+          <w:ilvl w:val="2"/>
+          <w:numId w:val="1"/>
+        </w:numPr>
+      </w:pPr>
+      <w:proofErr w:type="spellStart"/>
       <w:r>
         <w:t>CreatedAt</w:t>
       </w:r>
-    </w:p>
-    <w:p>
-      <w:pPr>
-        <w:pStyle w:val="Prrafodelista"/>
-        <w:numPr>
-          <w:ilvl w:val="2"/>
-          <w:numId w:val="1"/>
-        </w:numPr>
-      </w:pPr>
+      <w:proofErr w:type="spellEnd"/>
+    </w:p>
+    <w:p>
+      <w:pPr>
+        <w:pStyle w:val="Prrafodelista"/>
+        <w:numPr>
+          <w:ilvl w:val="2"/>
+          <w:numId w:val="1"/>
+        </w:numPr>
+      </w:pPr>
+      <w:proofErr w:type="spellStart"/>
       <w:r>
         <w:t>IDRole</w:t>
       </w:r>
-    </w:p>
-    <w:p>
-      <w:pPr>
-        <w:pStyle w:val="Prrafodelista"/>
-        <w:numPr>
-          <w:ilvl w:val="2"/>
-          <w:numId w:val="1"/>
-        </w:numPr>
-      </w:pPr>
+      <w:proofErr w:type="spellEnd"/>
+    </w:p>
+    <w:p>
+      <w:pPr>
+        <w:pStyle w:val="Prrafodelista"/>
+        <w:numPr>
+          <w:ilvl w:val="2"/>
+          <w:numId w:val="1"/>
+        </w:numPr>
+      </w:pPr>
+      <w:proofErr w:type="spellStart"/>
       <w:r>
         <w:t>IDAddress</w:t>
       </w:r>
-    </w:p>
-    <w:p>
-      <w:pPr>
-        <w:pStyle w:val="Prrafodelista"/>
-        <w:numPr>
-          <w:ilvl w:val="2"/>
-          <w:numId w:val="1"/>
-        </w:numPr>
-      </w:pPr>
+      <w:proofErr w:type="spellEnd"/>
+    </w:p>
+    <w:p>
+      <w:pPr>
+        <w:pStyle w:val="Prrafodelista"/>
+        <w:numPr>
+          <w:ilvl w:val="2"/>
+          <w:numId w:val="1"/>
+        </w:numPr>
+      </w:pPr>
+      <w:proofErr w:type="spellStart"/>
       <w:r>
         <w:t>Phone</w:t>
       </w:r>
+      <w:proofErr w:type="spellEnd"/>
     </w:p>
     <w:p>
       <w:pPr>
@@ -178,9 +192,11 @@
           <w:numId w:val="1"/>
         </w:numPr>
       </w:pPr>
+      <w:proofErr w:type="spellStart"/>
       <w:r>
         <w:t>Address</w:t>
       </w:r>
+      <w:proofErr w:type="spellEnd"/>
     </w:p>
     <w:p>
       <w:pPr>
@@ -239,6 +255,18 @@
         </w:numPr>
       </w:pPr>
       <w:r>
+        <w:t>City</w:t>
+      </w:r>
+    </w:p>
+    <w:p>
+      <w:pPr>
+        <w:pStyle w:val="Prrafodelista"/>
+        <w:numPr>
+          <w:ilvl w:val="2"/>
+          <w:numId w:val="1"/>
+        </w:numPr>
+      </w:pPr>
+      <w:r>
         <w:t>Street</w:t>
       </w:r>
     </w:p>
@@ -253,17 +281,29 @@
       <w:r>
         <w:t>Number</w:t>
       </w:r>
-    </w:p>
-    <w:p>
-      <w:pPr>
-        <w:pStyle w:val="Prrafodelista"/>
-        <w:numPr>
-          <w:ilvl w:val="2"/>
-          <w:numId w:val="1"/>
-        </w:numPr>
-      </w:pPr>
-      <w:r>
-        <w:t>CP</w:t>
+      <w:r>
+        <w:t xml:space="preserve"> </w:t>
+      </w:r>
+      <w:r>
+        <w:t>House</w:t>
+      </w:r>
+    </w:p>
+    <w:p>
+      <w:pPr>
+        <w:pStyle w:val="Prrafodelista"/>
+        <w:numPr>
+          <w:ilvl w:val="2"/>
+          <w:numId w:val="1"/>
+        </w:numPr>
+      </w:pPr>
+      <w:r>
+        <w:t>Zip</w:t>
+      </w:r>
+      <w:r>
+        <w:t xml:space="preserve"> </w:t>
+      </w:r>
+      <w:r>
+        <w:t>Code</w:t>
       </w:r>
     </w:p>
     <w:p>
@@ -351,9 +391,11 @@
           <w:numId w:val="1"/>
         </w:numPr>
       </w:pPr>
+      <w:proofErr w:type="spellStart"/>
       <w:r>
         <w:t>Product</w:t>
       </w:r>
+      <w:proofErr w:type="spellEnd"/>
     </w:p>
     <w:p>
       <w:pPr>
@@ -399,20 +441,22 @@
           <w:numId w:val="1"/>
         </w:numPr>
       </w:pPr>
-      <w:r>
+      <w:proofErr w:type="spellStart"/>
+      <w:r>
+        <w:lastRenderedPageBreak/>
         <w:t>Description</w:t>
       </w:r>
-    </w:p>
-    <w:p>
-      <w:pPr>
-        <w:pStyle w:val="Prrafodelista"/>
-        <w:numPr>
-          <w:ilvl w:val="2"/>
-          <w:numId w:val="1"/>
-        </w:numPr>
-      </w:pPr>
-      <w:r>
-        <w:lastRenderedPageBreak/>
+      <w:proofErr w:type="spellEnd"/>
+    </w:p>
+    <w:p>
+      <w:pPr>
+        <w:pStyle w:val="Prrafodelista"/>
+        <w:numPr>
+          <w:ilvl w:val="2"/>
+          <w:numId w:val="1"/>
+        </w:numPr>
+      </w:pPr>
+      <w:r>
         <w:t>Price</w:t>
       </w:r>
     </w:p>
@@ -430,9 +474,11 @@
           <w:numId w:val="1"/>
         </w:numPr>
       </w:pPr>
+      <w:proofErr w:type="spellStart"/>
       <w:r>
         <w:t>StockBox</w:t>
       </w:r>
+      <w:proofErr w:type="spellEnd"/>
       <w:r>
         <w:t xml:space="preserve"> (Cantidad de cajas disponibles)</w:t>
       </w:r>
@@ -445,9 +491,11 @@
           <w:numId w:val="1"/>
         </w:numPr>
       </w:pPr>
+      <w:proofErr w:type="spellStart"/>
       <w:r>
         <w:t>StockUnit</w:t>
       </w:r>
+      <w:proofErr w:type="spellEnd"/>
       <w:r>
         <w:t xml:space="preserve"> (Cantidad de unidades disponibles)</w:t>
       </w:r>
@@ -460,21 +508,25 @@
           <w:numId w:val="1"/>
         </w:numPr>
       </w:pPr>
+      <w:proofErr w:type="spellStart"/>
       <w:r>
         <w:t>CreatedAt</w:t>
       </w:r>
-    </w:p>
-    <w:p>
-      <w:pPr>
-        <w:pStyle w:val="Prrafodelista"/>
-        <w:numPr>
-          <w:ilvl w:val="2"/>
-          <w:numId w:val="1"/>
-        </w:numPr>
-      </w:pPr>
+      <w:proofErr w:type="spellEnd"/>
+    </w:p>
+    <w:p>
+      <w:pPr>
+        <w:pStyle w:val="Prrafodelista"/>
+        <w:numPr>
+          <w:ilvl w:val="2"/>
+          <w:numId w:val="1"/>
+        </w:numPr>
+      </w:pPr>
+      <w:proofErr w:type="spellStart"/>
       <w:r>
         <w:t>LastUpdated</w:t>
       </w:r>
+      <w:proofErr w:type="spellEnd"/>
     </w:p>
     <w:p>
       <w:pPr>
@@ -497,9 +549,11 @@
           <w:numId w:val="1"/>
         </w:numPr>
       </w:pPr>
+      <w:proofErr w:type="spellStart"/>
       <w:r>
         <w:t>Order</w:t>
       </w:r>
+      <w:proofErr w:type="spellEnd"/>
     </w:p>
     <w:p>
       <w:pPr>
@@ -533,9 +587,11 @@
           <w:numId w:val="1"/>
         </w:numPr>
       </w:pPr>
+      <w:proofErr w:type="spellStart"/>
       <w:r>
         <w:t>UserId</w:t>
       </w:r>
+      <w:proofErr w:type="spellEnd"/>
     </w:p>
     <w:p>
       <w:pPr>
@@ -557,33 +613,39 @@
           <w:numId w:val="1"/>
         </w:numPr>
       </w:pPr>
+      <w:proofErr w:type="gramStart"/>
       <w:r>
         <w:t>Status</w:t>
       </w:r>
-    </w:p>
-    <w:p>
-      <w:pPr>
-        <w:pStyle w:val="Prrafodelista"/>
-        <w:numPr>
-          <w:ilvl w:val="2"/>
-          <w:numId w:val="1"/>
-        </w:numPr>
-      </w:pPr>
+      <w:proofErr w:type="gramEnd"/>
+    </w:p>
+    <w:p>
+      <w:pPr>
+        <w:pStyle w:val="Prrafodelista"/>
+        <w:numPr>
+          <w:ilvl w:val="2"/>
+          <w:numId w:val="1"/>
+        </w:numPr>
+      </w:pPr>
+      <w:proofErr w:type="spellStart"/>
       <w:r>
         <w:t>CreatedAt</w:t>
       </w:r>
-    </w:p>
-    <w:p>
-      <w:pPr>
-        <w:pStyle w:val="Prrafodelista"/>
-        <w:numPr>
-          <w:ilvl w:val="2"/>
-          <w:numId w:val="1"/>
-        </w:numPr>
-      </w:pPr>
+      <w:proofErr w:type="spellEnd"/>
+    </w:p>
+    <w:p>
+      <w:pPr>
+        <w:pStyle w:val="Prrafodelista"/>
+        <w:numPr>
+          <w:ilvl w:val="2"/>
+          <w:numId w:val="1"/>
+        </w:numPr>
+      </w:pPr>
+      <w:proofErr w:type="spellStart"/>
       <w:r>
         <w:t>LastUpdated</w:t>
       </w:r>
+      <w:proofErr w:type="spellEnd"/>
     </w:p>
     <w:p>
       <w:pPr>
@@ -594,7 +656,15 @@
         </w:numPr>
       </w:pPr>
       <w:r>
-        <w:t>Descripción: Esta entidad almacena las ordenes realizadas por lo usuarios</w:t>
+        <w:t xml:space="preserve">Descripción: Esta entidad almacena las ordenes realizadas por </w:t>
+      </w:r>
+      <w:proofErr w:type="spellStart"/>
+      <w:r>
+        <w:t>lo</w:t>
+      </w:r>
+      <w:proofErr w:type="spellEnd"/>
+      <w:r>
+        <w:t xml:space="preserve"> usuarios</w:t>
       </w:r>
     </w:p>
     <w:p/>
@@ -606,9 +676,11 @@
           <w:numId w:val="1"/>
         </w:numPr>
       </w:pPr>
+      <w:proofErr w:type="spellStart"/>
       <w:r>
         <w:t>OrderItem</w:t>
       </w:r>
+      <w:proofErr w:type="spellEnd"/>
     </w:p>
     <w:p>
       <w:pPr>
@@ -642,57 +714,67 @@
           <w:numId w:val="1"/>
         </w:numPr>
       </w:pPr>
+      <w:proofErr w:type="spellStart"/>
       <w:r>
         <w:t>OrderId</w:t>
       </w:r>
-    </w:p>
-    <w:p>
-      <w:pPr>
-        <w:pStyle w:val="Prrafodelista"/>
-        <w:numPr>
-          <w:ilvl w:val="2"/>
-          <w:numId w:val="1"/>
-        </w:numPr>
-      </w:pPr>
+      <w:proofErr w:type="spellEnd"/>
+    </w:p>
+    <w:p>
+      <w:pPr>
+        <w:pStyle w:val="Prrafodelista"/>
+        <w:numPr>
+          <w:ilvl w:val="2"/>
+          <w:numId w:val="1"/>
+        </w:numPr>
+      </w:pPr>
+      <w:proofErr w:type="spellStart"/>
       <w:r>
         <w:t>ProductId</w:t>
       </w:r>
-    </w:p>
-    <w:p>
-      <w:pPr>
-        <w:pStyle w:val="Prrafodelista"/>
-        <w:numPr>
-          <w:ilvl w:val="2"/>
-          <w:numId w:val="1"/>
-        </w:numPr>
-      </w:pPr>
+      <w:proofErr w:type="spellEnd"/>
+    </w:p>
+    <w:p>
+      <w:pPr>
+        <w:pStyle w:val="Prrafodelista"/>
+        <w:numPr>
+          <w:ilvl w:val="2"/>
+          <w:numId w:val="1"/>
+        </w:numPr>
+      </w:pPr>
+      <w:proofErr w:type="spellStart"/>
       <w:r>
         <w:t>QuantityBox</w:t>
       </w:r>
-    </w:p>
-    <w:p>
-      <w:pPr>
-        <w:pStyle w:val="Prrafodelista"/>
-        <w:numPr>
-          <w:ilvl w:val="2"/>
-          <w:numId w:val="1"/>
-        </w:numPr>
-      </w:pPr>
+      <w:proofErr w:type="spellEnd"/>
+    </w:p>
+    <w:p>
+      <w:pPr>
+        <w:pStyle w:val="Prrafodelista"/>
+        <w:numPr>
+          <w:ilvl w:val="2"/>
+          <w:numId w:val="1"/>
+        </w:numPr>
+      </w:pPr>
+      <w:proofErr w:type="spellStart"/>
       <w:r>
         <w:t>QuantityUnit</w:t>
       </w:r>
-    </w:p>
-    <w:p>
-      <w:pPr>
-        <w:pStyle w:val="Prrafodelista"/>
-        <w:numPr>
-          <w:ilvl w:val="2"/>
-          <w:numId w:val="1"/>
-        </w:numPr>
-      </w:pPr>
+      <w:proofErr w:type="spellEnd"/>
+    </w:p>
+    <w:p>
+      <w:pPr>
+        <w:pStyle w:val="Prrafodelista"/>
+        <w:numPr>
+          <w:ilvl w:val="2"/>
+          <w:numId w:val="1"/>
+        </w:numPr>
+      </w:pPr>
+      <w:proofErr w:type="spellStart"/>
       <w:r>
         <w:t>UnitPrice</w:t>
       </w:r>
+      <w:proofErr w:type="spellEnd"/>
     </w:p>
     <w:p>
       <w:pPr>
@@ -799,7 +881,15 @@
         </w:numPr>
       </w:pPr>
       <w:r>
-        <w:t>Un OrderItem debe contener cantidad por caja o por unidad, pero no ambas.</w:t>
+        <w:t xml:space="preserve">Un </w:t>
+      </w:r>
+      <w:proofErr w:type="spellStart"/>
+      <w:r>
+        <w:t>OrderItem</w:t>
+      </w:r>
+      <w:proofErr w:type="spellEnd"/>
+      <w:r>
+        <w:t xml:space="preserve"> debe contener cantidad por caja o por unidad, pero no ambas.</w:t>
       </w:r>
     </w:p>
     <w:p/>
@@ -1753,6 +1843,7 @@
   <w:style w:type="character" w:default="1" w:styleId="Fuentedeprrafopredeter">
     <w:name w:val="Default Paragraph Font"/>
     <w:uiPriority w:val="1"/>
+    <w:semiHidden/>
     <w:unhideWhenUsed/>
   </w:style>
   <w:style w:type="table" w:default="1" w:styleId="Tablanormal">

</xml_diff>

<commit_message>
develop: add products and categories models
</commit_message>
<xml_diff>
--- a/documentacion/docs/Entidades del sistema v1.docx
+++ b/documentacion/docs/Entidades del sistema v1.docx
@@ -18,11 +18,9 @@
           <w:numId w:val="1"/>
         </w:numPr>
       </w:pPr>
-      <w:proofErr w:type="spellStart"/>
       <w:r>
         <w:t>User</w:t>
       </w:r>
-      <w:proofErr w:type="spellEnd"/>
     </w:p>
     <w:p>
       <w:pPr>
@@ -56,11 +54,9 @@
           <w:numId w:val="1"/>
         </w:numPr>
       </w:pPr>
-      <w:proofErr w:type="spellStart"/>
       <w:r>
         <w:t>FirstName</w:t>
       </w:r>
-      <w:proofErr w:type="spellEnd"/>
     </w:p>
     <w:p>
       <w:pPr>
@@ -94,67 +90,57 @@
           <w:numId w:val="1"/>
         </w:numPr>
       </w:pPr>
-      <w:proofErr w:type="spellStart"/>
       <w:r>
         <w:t>Password</w:t>
       </w:r>
-      <w:proofErr w:type="spellEnd"/>
-    </w:p>
-    <w:p>
-      <w:pPr>
-        <w:pStyle w:val="Prrafodelista"/>
-        <w:numPr>
-          <w:ilvl w:val="2"/>
-          <w:numId w:val="1"/>
-        </w:numPr>
-      </w:pPr>
-      <w:proofErr w:type="spellStart"/>
+    </w:p>
+    <w:p>
+      <w:pPr>
+        <w:pStyle w:val="Prrafodelista"/>
+        <w:numPr>
+          <w:ilvl w:val="2"/>
+          <w:numId w:val="1"/>
+        </w:numPr>
+      </w:pPr>
       <w:r>
         <w:t>CreatedAt</w:t>
       </w:r>
-      <w:proofErr w:type="spellEnd"/>
-    </w:p>
-    <w:p>
-      <w:pPr>
-        <w:pStyle w:val="Prrafodelista"/>
-        <w:numPr>
-          <w:ilvl w:val="2"/>
-          <w:numId w:val="1"/>
-        </w:numPr>
-      </w:pPr>
-      <w:proofErr w:type="spellStart"/>
+    </w:p>
+    <w:p>
+      <w:pPr>
+        <w:pStyle w:val="Prrafodelista"/>
+        <w:numPr>
+          <w:ilvl w:val="2"/>
+          <w:numId w:val="1"/>
+        </w:numPr>
+      </w:pPr>
       <w:r>
         <w:t>IDRole</w:t>
       </w:r>
-      <w:proofErr w:type="spellEnd"/>
-    </w:p>
-    <w:p>
-      <w:pPr>
-        <w:pStyle w:val="Prrafodelista"/>
-        <w:numPr>
-          <w:ilvl w:val="2"/>
-          <w:numId w:val="1"/>
-        </w:numPr>
-      </w:pPr>
-      <w:proofErr w:type="spellStart"/>
+    </w:p>
+    <w:p>
+      <w:pPr>
+        <w:pStyle w:val="Prrafodelista"/>
+        <w:numPr>
+          <w:ilvl w:val="2"/>
+          <w:numId w:val="1"/>
+        </w:numPr>
+      </w:pPr>
       <w:r>
         <w:t>IDAddress</w:t>
       </w:r>
-      <w:proofErr w:type="spellEnd"/>
-    </w:p>
-    <w:p>
-      <w:pPr>
-        <w:pStyle w:val="Prrafodelista"/>
-        <w:numPr>
-          <w:ilvl w:val="2"/>
-          <w:numId w:val="1"/>
-        </w:numPr>
-      </w:pPr>
-      <w:proofErr w:type="spellStart"/>
+    </w:p>
+    <w:p>
+      <w:pPr>
+        <w:pStyle w:val="Prrafodelista"/>
+        <w:numPr>
+          <w:ilvl w:val="2"/>
+          <w:numId w:val="1"/>
+        </w:numPr>
+      </w:pPr>
       <w:r>
         <w:t>Phone</w:t>
       </w:r>
-      <w:proofErr w:type="spellEnd"/>
     </w:p>
     <w:p>
       <w:pPr>
@@ -192,11 +178,9 @@
           <w:numId w:val="1"/>
         </w:numPr>
       </w:pPr>
-      <w:proofErr w:type="spellStart"/>
       <w:r>
         <w:t>Address</w:t>
       </w:r>
-      <w:proofErr w:type="spellEnd"/>
     </w:p>
     <w:p>
       <w:pPr>
@@ -391,11 +375,9 @@
           <w:numId w:val="1"/>
         </w:numPr>
       </w:pPr>
-      <w:proofErr w:type="spellStart"/>
       <w:r>
         <w:t>Product</w:t>
       </w:r>
-      <w:proofErr w:type="spellEnd"/>
     </w:p>
     <w:p>
       <w:pPr>
@@ -441,12 +423,10 @@
           <w:numId w:val="1"/>
         </w:numPr>
       </w:pPr>
-      <w:proofErr w:type="spellStart"/>
       <w:r>
         <w:lastRenderedPageBreak/>
         <w:t>Description</w:t>
       </w:r>
-      <w:proofErr w:type="spellEnd"/>
     </w:p>
     <w:p>
       <w:pPr>
@@ -463,22 +443,14 @@
     <w:p>
       <w:pPr>
         <w:pStyle w:val="Prrafodelista"/>
-        <w:ind w:left="2160"/>
-      </w:pPr>
-    </w:p>
-    <w:p>
-      <w:pPr>
-        <w:pStyle w:val="Prrafodelista"/>
-        <w:numPr>
-          <w:ilvl w:val="2"/>
-          <w:numId w:val="1"/>
-        </w:numPr>
-      </w:pPr>
-      <w:proofErr w:type="spellStart"/>
+        <w:numPr>
+          <w:ilvl w:val="2"/>
+          <w:numId w:val="1"/>
+        </w:numPr>
+      </w:pPr>
       <w:r>
         <w:t>StockBox</w:t>
       </w:r>
-      <w:proofErr w:type="spellEnd"/>
       <w:r>
         <w:t xml:space="preserve"> (Cantidad de cajas disponibles)</w:t>
       </w:r>
@@ -491,11 +463,9 @@
           <w:numId w:val="1"/>
         </w:numPr>
       </w:pPr>
-      <w:proofErr w:type="spellStart"/>
       <w:r>
         <w:t>StockUnit</w:t>
       </w:r>
-      <w:proofErr w:type="spellEnd"/>
       <w:r>
         <w:t xml:space="preserve"> (Cantidad de unidades disponibles)</w:t>
       </w:r>
@@ -508,25 +478,57 @@
           <w:numId w:val="1"/>
         </w:numPr>
       </w:pPr>
-      <w:proofErr w:type="spellStart"/>
+      <w:r>
+        <w:t>Active</w:t>
+      </w:r>
+    </w:p>
+    <w:p>
+      <w:pPr>
+        <w:pStyle w:val="Prrafodelista"/>
+        <w:numPr>
+          <w:ilvl w:val="2"/>
+          <w:numId w:val="1"/>
+        </w:numPr>
+      </w:pPr>
+      <w:r>
+        <w:t>Category</w:t>
+      </w:r>
+    </w:p>
+    <w:p>
+      <w:pPr>
+        <w:pStyle w:val="Prrafodelista"/>
+        <w:numPr>
+          <w:ilvl w:val="2"/>
+          <w:numId w:val="1"/>
+        </w:numPr>
+      </w:pPr>
       <w:r>
         <w:t>CreatedAt</w:t>
       </w:r>
-      <w:proofErr w:type="spellEnd"/>
-    </w:p>
-    <w:p>
-      <w:pPr>
-        <w:pStyle w:val="Prrafodelista"/>
-        <w:numPr>
-          <w:ilvl w:val="2"/>
-          <w:numId w:val="1"/>
-        </w:numPr>
-      </w:pPr>
-      <w:proofErr w:type="spellStart"/>
+    </w:p>
+    <w:p>
+      <w:pPr>
+        <w:pStyle w:val="Prrafodelista"/>
+        <w:numPr>
+          <w:ilvl w:val="2"/>
+          <w:numId w:val="1"/>
+        </w:numPr>
+      </w:pPr>
       <w:r>
         <w:t>LastUpdated</w:t>
       </w:r>
-      <w:proofErr w:type="spellEnd"/>
+    </w:p>
+    <w:p>
+      <w:pPr>
+        <w:pStyle w:val="Prrafodelista"/>
+        <w:numPr>
+          <w:ilvl w:val="2"/>
+          <w:numId w:val="1"/>
+        </w:numPr>
+      </w:pPr>
+      <w:r>
+        <w:t>imageUrl (Url de la imagen del producto como referencia)</w:t>
+      </w:r>
     </w:p>
     <w:p>
       <w:pPr>
@@ -540,6 +542,71 @@
         <w:t>Descripción: Esta entidad almacena todos los productos disponibles en la tienda</w:t>
       </w:r>
     </w:p>
+    <w:p>
+      <w:pPr>
+        <w:ind w:left="1080"/>
+      </w:pPr>
+    </w:p>
+    <w:p>
+      <w:pPr>
+        <w:pStyle w:val="Prrafodelista"/>
+        <w:numPr>
+          <w:ilvl w:val="0"/>
+          <w:numId w:val="1"/>
+        </w:numPr>
+      </w:pPr>
+      <w:r>
+        <w:t>CategoryProductos</w:t>
+      </w:r>
+    </w:p>
+    <w:p>
+      <w:pPr>
+        <w:pStyle w:val="Prrafodelista"/>
+        <w:numPr>
+          <w:ilvl w:val="1"/>
+          <w:numId w:val="1"/>
+        </w:numPr>
+      </w:pPr>
+      <w:r>
+        <w:t>Campos</w:t>
+      </w:r>
+    </w:p>
+    <w:p>
+      <w:pPr>
+        <w:pStyle w:val="Prrafodelista"/>
+        <w:numPr>
+          <w:ilvl w:val="2"/>
+          <w:numId w:val="1"/>
+        </w:numPr>
+      </w:pPr>
+      <w:r>
+        <w:t>ID</w:t>
+      </w:r>
+    </w:p>
+    <w:p>
+      <w:pPr>
+        <w:pStyle w:val="Prrafodelista"/>
+        <w:numPr>
+          <w:ilvl w:val="2"/>
+          <w:numId w:val="1"/>
+        </w:numPr>
+      </w:pPr>
+      <w:r>
+        <w:t>Category</w:t>
+      </w:r>
+    </w:p>
+    <w:p>
+      <w:pPr>
+        <w:pStyle w:val="Prrafodelista"/>
+        <w:numPr>
+          <w:ilvl w:val="1"/>
+          <w:numId w:val="1"/>
+        </w:numPr>
+      </w:pPr>
+      <w:r>
+        <w:t>Descripción: Esta entidad almacenara las categorías a los que pertenece cada producto para su clasificación</w:t>
+      </w:r>
+    </w:p>
     <w:p/>
     <w:p>
       <w:pPr>
@@ -549,11 +616,9 @@
           <w:numId w:val="1"/>
         </w:numPr>
       </w:pPr>
-      <w:proofErr w:type="spellStart"/>
       <w:r>
         <w:t>Order</w:t>
       </w:r>
-      <w:proofErr w:type="spellEnd"/>
     </w:p>
     <w:p>
       <w:pPr>
@@ -587,11 +652,9 @@
           <w:numId w:val="1"/>
         </w:numPr>
       </w:pPr>
-      <w:proofErr w:type="spellStart"/>
       <w:r>
         <w:t>UserId</w:t>
       </w:r>
-      <w:proofErr w:type="spellEnd"/>
     </w:p>
     <w:p>
       <w:pPr>
@@ -613,39 +676,33 @@
           <w:numId w:val="1"/>
         </w:numPr>
       </w:pPr>
-      <w:proofErr w:type="gramStart"/>
       <w:r>
         <w:t>Status</w:t>
       </w:r>
-      <w:proofErr w:type="gramEnd"/>
-    </w:p>
-    <w:p>
-      <w:pPr>
-        <w:pStyle w:val="Prrafodelista"/>
-        <w:numPr>
-          <w:ilvl w:val="2"/>
-          <w:numId w:val="1"/>
-        </w:numPr>
-      </w:pPr>
-      <w:proofErr w:type="spellStart"/>
+    </w:p>
+    <w:p>
+      <w:pPr>
+        <w:pStyle w:val="Prrafodelista"/>
+        <w:numPr>
+          <w:ilvl w:val="2"/>
+          <w:numId w:val="1"/>
+        </w:numPr>
+      </w:pPr>
       <w:r>
         <w:t>CreatedAt</w:t>
       </w:r>
-      <w:proofErr w:type="spellEnd"/>
-    </w:p>
-    <w:p>
-      <w:pPr>
-        <w:pStyle w:val="Prrafodelista"/>
-        <w:numPr>
-          <w:ilvl w:val="2"/>
-          <w:numId w:val="1"/>
-        </w:numPr>
-      </w:pPr>
-      <w:proofErr w:type="spellStart"/>
+    </w:p>
+    <w:p>
+      <w:pPr>
+        <w:pStyle w:val="Prrafodelista"/>
+        <w:numPr>
+          <w:ilvl w:val="2"/>
+          <w:numId w:val="1"/>
+        </w:numPr>
+      </w:pPr>
       <w:r>
         <w:t>LastUpdated</w:t>
       </w:r>
-      <w:proofErr w:type="spellEnd"/>
     </w:p>
     <w:p>
       <w:pPr>
@@ -656,15 +713,7 @@
         </w:numPr>
       </w:pPr>
       <w:r>
-        <w:t xml:space="preserve">Descripción: Esta entidad almacena las ordenes realizadas por </w:t>
-      </w:r>
-      <w:proofErr w:type="spellStart"/>
-      <w:r>
-        <w:t>lo</w:t>
-      </w:r>
-      <w:proofErr w:type="spellEnd"/>
-      <w:r>
-        <w:t xml:space="preserve"> usuarios</w:t>
+        <w:t>Descripción: Esta entidad almacena las ordenes realizadas por lo usuarios</w:t>
       </w:r>
     </w:p>
     <w:p/>
@@ -676,11 +725,9 @@
           <w:numId w:val="1"/>
         </w:numPr>
       </w:pPr>
-      <w:proofErr w:type="spellStart"/>
       <w:r>
         <w:t>OrderItem</w:t>
       </w:r>
-      <w:proofErr w:type="spellEnd"/>
     </w:p>
     <w:p>
       <w:pPr>
@@ -714,67 +761,57 @@
           <w:numId w:val="1"/>
         </w:numPr>
       </w:pPr>
-      <w:proofErr w:type="spellStart"/>
       <w:r>
         <w:t>OrderId</w:t>
       </w:r>
-      <w:proofErr w:type="spellEnd"/>
-    </w:p>
-    <w:p>
-      <w:pPr>
-        <w:pStyle w:val="Prrafodelista"/>
-        <w:numPr>
-          <w:ilvl w:val="2"/>
-          <w:numId w:val="1"/>
-        </w:numPr>
-      </w:pPr>
-      <w:proofErr w:type="spellStart"/>
+    </w:p>
+    <w:p>
+      <w:pPr>
+        <w:pStyle w:val="Prrafodelista"/>
+        <w:numPr>
+          <w:ilvl w:val="2"/>
+          <w:numId w:val="1"/>
+        </w:numPr>
+      </w:pPr>
       <w:r>
         <w:t>ProductId</w:t>
       </w:r>
-      <w:proofErr w:type="spellEnd"/>
-    </w:p>
-    <w:p>
-      <w:pPr>
-        <w:pStyle w:val="Prrafodelista"/>
-        <w:numPr>
-          <w:ilvl w:val="2"/>
-          <w:numId w:val="1"/>
-        </w:numPr>
-      </w:pPr>
-      <w:proofErr w:type="spellStart"/>
+    </w:p>
+    <w:p>
+      <w:pPr>
+        <w:pStyle w:val="Prrafodelista"/>
+        <w:numPr>
+          <w:ilvl w:val="2"/>
+          <w:numId w:val="1"/>
+        </w:numPr>
+      </w:pPr>
       <w:r>
         <w:t>QuantityBox</w:t>
       </w:r>
-      <w:proofErr w:type="spellEnd"/>
-    </w:p>
-    <w:p>
-      <w:pPr>
-        <w:pStyle w:val="Prrafodelista"/>
-        <w:numPr>
-          <w:ilvl w:val="2"/>
-          <w:numId w:val="1"/>
-        </w:numPr>
-      </w:pPr>
-      <w:proofErr w:type="spellStart"/>
+    </w:p>
+    <w:p>
+      <w:pPr>
+        <w:pStyle w:val="Prrafodelista"/>
+        <w:numPr>
+          <w:ilvl w:val="2"/>
+          <w:numId w:val="1"/>
+        </w:numPr>
+      </w:pPr>
       <w:r>
         <w:t>QuantityUnit</w:t>
       </w:r>
-      <w:proofErr w:type="spellEnd"/>
-    </w:p>
-    <w:p>
-      <w:pPr>
-        <w:pStyle w:val="Prrafodelista"/>
-        <w:numPr>
-          <w:ilvl w:val="2"/>
-          <w:numId w:val="1"/>
-        </w:numPr>
-      </w:pPr>
-      <w:proofErr w:type="spellStart"/>
+    </w:p>
+    <w:p>
+      <w:pPr>
+        <w:pStyle w:val="Prrafodelista"/>
+        <w:numPr>
+          <w:ilvl w:val="2"/>
+          <w:numId w:val="1"/>
+        </w:numPr>
+      </w:pPr>
       <w:r>
         <w:t>UnitPrice</w:t>
       </w:r>
-      <w:proofErr w:type="spellEnd"/>
     </w:p>
     <w:p>
       <w:pPr>
@@ -791,6 +828,7 @@
         <w:t>el producto agregado a un pedido en especifico</w:t>
       </w:r>
     </w:p>
+    <w:p/>
     <w:p/>
     <w:p>
       <w:pPr>
@@ -881,15 +919,19 @@
         </w:numPr>
       </w:pPr>
       <w:r>
-        <w:t xml:space="preserve">Un </w:t>
-      </w:r>
-      <w:proofErr w:type="spellStart"/>
-      <w:r>
-        <w:t>OrderItem</w:t>
-      </w:r>
-      <w:proofErr w:type="spellEnd"/>
-      <w:r>
-        <w:t xml:space="preserve"> debe contener cantidad por caja o por unidad, pero no ambas.</w:t>
+        <w:t>Un producto solo puede pertenecer a una categoría</w:t>
+      </w:r>
+    </w:p>
+    <w:p>
+      <w:pPr>
+        <w:pStyle w:val="Prrafodelista"/>
+        <w:numPr>
+          <w:ilvl w:val="0"/>
+          <w:numId w:val="2"/>
+        </w:numPr>
+      </w:pPr>
+      <w:r>
+        <w:t>Un OrderItem debe contener cantidad por caja o por unidad, pero no ambas.</w:t>
       </w:r>
     </w:p>
     <w:p/>
@@ -898,7 +940,6 @@
         <w:pStyle w:val="Subttulo"/>
       </w:pPr>
       <w:r>
-        <w:lastRenderedPageBreak/>
         <w:t>Consideraciones</w:t>
       </w:r>
     </w:p>

</xml_diff>

<commit_message>
develop modules: add cart and items-cart modules
</commit_message>
<xml_diff>
--- a/documentacion/docs/Entidades del sistema v1.docx
+++ b/documentacion/docs/Entidades del sistema v1.docx
@@ -617,6 +617,219 @@
         </w:numPr>
       </w:pPr>
       <w:r>
+        <w:t>Cart</w:t>
+      </w:r>
+    </w:p>
+    <w:p>
+      <w:pPr>
+        <w:pStyle w:val="Prrafodelista"/>
+        <w:numPr>
+          <w:ilvl w:val="1"/>
+          <w:numId w:val="1"/>
+        </w:numPr>
+      </w:pPr>
+      <w:r>
+        <w:t>Campos</w:t>
+      </w:r>
+    </w:p>
+    <w:p>
+      <w:pPr>
+        <w:pStyle w:val="Prrafodelista"/>
+        <w:numPr>
+          <w:ilvl w:val="2"/>
+          <w:numId w:val="1"/>
+        </w:numPr>
+      </w:pPr>
+      <w:r>
+        <w:t>ID</w:t>
+      </w:r>
+    </w:p>
+    <w:p>
+      <w:pPr>
+        <w:pStyle w:val="Prrafodelista"/>
+        <w:numPr>
+          <w:ilvl w:val="2"/>
+          <w:numId w:val="1"/>
+        </w:numPr>
+      </w:pPr>
+      <w:r>
+        <w:t>User</w:t>
+      </w:r>
+    </w:p>
+    <w:p>
+      <w:pPr>
+        <w:pStyle w:val="Prrafodelista"/>
+        <w:numPr>
+          <w:ilvl w:val="2"/>
+          <w:numId w:val="1"/>
+        </w:numPr>
+      </w:pPr>
+      <w:r>
+        <w:t>Active</w:t>
+      </w:r>
+    </w:p>
+    <w:p>
+      <w:pPr>
+        <w:pStyle w:val="Prrafodelista"/>
+        <w:numPr>
+          <w:ilvl w:val="2"/>
+          <w:numId w:val="1"/>
+        </w:numPr>
+      </w:pPr>
+      <w:r>
+        <w:t>CartItems</w:t>
+      </w:r>
+    </w:p>
+    <w:p>
+      <w:pPr>
+        <w:pStyle w:val="Prrafodelista"/>
+        <w:numPr>
+          <w:ilvl w:val="2"/>
+          <w:numId w:val="1"/>
+        </w:numPr>
+      </w:pPr>
+      <w:r>
+        <w:t>CreatedAt</w:t>
+      </w:r>
+    </w:p>
+    <w:p>
+      <w:pPr>
+        <w:pStyle w:val="Prrafodelista"/>
+        <w:numPr>
+          <w:ilvl w:val="2"/>
+          <w:numId w:val="1"/>
+        </w:numPr>
+      </w:pPr>
+      <w:r>
+        <w:t>LastUpdate</w:t>
+      </w:r>
+      <w:r>
+        <w:t>At</w:t>
+      </w:r>
+    </w:p>
+    <w:p>
+      <w:pPr>
+        <w:pStyle w:val="Prrafodelista"/>
+        <w:numPr>
+          <w:ilvl w:val="1"/>
+          <w:numId w:val="1"/>
+        </w:numPr>
+      </w:pPr>
+      <w:r>
+        <w:t>Descripción: Esta entidad almacena el conjunto de productos seleccionados por el usuario</w:t>
+      </w:r>
+    </w:p>
+    <w:p/>
+    <w:p>
+      <w:pPr>
+        <w:pStyle w:val="Prrafodelista"/>
+        <w:numPr>
+          <w:ilvl w:val="0"/>
+          <w:numId w:val="1"/>
+        </w:numPr>
+      </w:pPr>
+      <w:r>
+        <w:t>CartItem</w:t>
+      </w:r>
+    </w:p>
+    <w:p>
+      <w:pPr>
+        <w:pStyle w:val="Prrafodelista"/>
+        <w:numPr>
+          <w:ilvl w:val="1"/>
+          <w:numId w:val="1"/>
+        </w:numPr>
+      </w:pPr>
+      <w:r>
+        <w:t>Campos</w:t>
+      </w:r>
+    </w:p>
+    <w:p>
+      <w:pPr>
+        <w:pStyle w:val="Prrafodelista"/>
+        <w:numPr>
+          <w:ilvl w:val="2"/>
+          <w:numId w:val="1"/>
+        </w:numPr>
+      </w:pPr>
+      <w:r>
+        <w:t>ID</w:t>
+      </w:r>
+    </w:p>
+    <w:p>
+      <w:pPr>
+        <w:pStyle w:val="Prrafodelista"/>
+        <w:numPr>
+          <w:ilvl w:val="2"/>
+          <w:numId w:val="1"/>
+        </w:numPr>
+      </w:pPr>
+      <w:r>
+        <w:t>IDCart</w:t>
+      </w:r>
+    </w:p>
+    <w:p>
+      <w:pPr>
+        <w:pStyle w:val="Prrafodelista"/>
+        <w:numPr>
+          <w:ilvl w:val="2"/>
+          <w:numId w:val="1"/>
+        </w:numPr>
+      </w:pPr>
+      <w:r>
+        <w:t>IDProduct</w:t>
+      </w:r>
+    </w:p>
+    <w:p>
+      <w:pPr>
+        <w:pStyle w:val="Prrafodelista"/>
+        <w:numPr>
+          <w:ilvl w:val="2"/>
+          <w:numId w:val="1"/>
+        </w:numPr>
+      </w:pPr>
+      <w:r>
+        <w:t>Quantity</w:t>
+      </w:r>
+      <w:r>
+        <w:t>Box</w:t>
+      </w:r>
+    </w:p>
+    <w:p>
+      <w:pPr>
+        <w:pStyle w:val="Prrafodelista"/>
+        <w:numPr>
+          <w:ilvl w:val="2"/>
+          <w:numId w:val="1"/>
+        </w:numPr>
+      </w:pPr>
+      <w:r>
+        <w:t>QuantityUnit</w:t>
+      </w:r>
+    </w:p>
+    <w:p>
+      <w:pPr>
+        <w:pStyle w:val="Prrafodelista"/>
+        <w:numPr>
+          <w:ilvl w:val="1"/>
+          <w:numId w:val="1"/>
+        </w:numPr>
+      </w:pPr>
+      <w:r>
+        <w:t>Descripción: Esta entidad almacena cada producto que pertenece a algún carrito en particular</w:t>
+      </w:r>
+    </w:p>
+    <w:p/>
+    <w:p>
+      <w:pPr>
+        <w:pStyle w:val="Prrafodelista"/>
+        <w:numPr>
+          <w:ilvl w:val="0"/>
+          <w:numId w:val="1"/>
+        </w:numPr>
+      </w:pPr>
+      <w:r>
+        <w:lastRenderedPageBreak/>
         <w:t>Order</w:t>
       </w:r>
     </w:p>
@@ -934,6 +1147,42 @@
         <w:t>Un OrderItem debe contener cantidad por caja o por unidad, pero no ambas.</w:t>
       </w:r>
     </w:p>
+    <w:p>
+      <w:pPr>
+        <w:pStyle w:val="Prrafodelista"/>
+        <w:numPr>
+          <w:ilvl w:val="0"/>
+          <w:numId w:val="2"/>
+        </w:numPr>
+      </w:pPr>
+      <w:r>
+        <w:t>Un usuario solo puede tener un cart</w:t>
+      </w:r>
+    </w:p>
+    <w:p>
+      <w:pPr>
+        <w:pStyle w:val="Prrafodelista"/>
+        <w:numPr>
+          <w:ilvl w:val="0"/>
+          <w:numId w:val="2"/>
+        </w:numPr>
+      </w:pPr>
+      <w:r>
+        <w:t>Un producto puede pertenecer a varios cart</w:t>
+      </w:r>
+    </w:p>
+    <w:p>
+      <w:pPr>
+        <w:pStyle w:val="Prrafodelista"/>
+        <w:numPr>
+          <w:ilvl w:val="0"/>
+          <w:numId w:val="2"/>
+        </w:numPr>
+      </w:pPr>
+      <w:r>
+        <w:t>Un cart puede tener varios productoss</w:t>
+      </w:r>
+    </w:p>
     <w:p/>
     <w:p>
       <w:pPr>
@@ -964,6 +1213,7 @@
         </w:numPr>
       </w:pPr>
       <w:r>
+        <w:lastRenderedPageBreak/>
         <w:t>En el MVP se utilizará un solo role CLIENTE, pero se dejará la estructura preparada para registrar más tipos de role en las fases posteriores</w:t>
       </w:r>
     </w:p>

</xml_diff>

<commit_message>
develop: add new order modules to manage order of users and updates in other services and entities
</commit_message>
<xml_diff>
--- a/documentacion/docs/Entidades del sistema v1.docx
+++ b/documentacion/docs/Entidades del sistema v1.docx
@@ -439,6 +439,21 @@
       <w:r>
         <w:t>Price</w:t>
       </w:r>
+      <w:r>
+        <w:t>Unit</w:t>
+      </w:r>
+    </w:p>
+    <w:p>
+      <w:pPr>
+        <w:pStyle w:val="Prrafodelista"/>
+        <w:numPr>
+          <w:ilvl w:val="2"/>
+          <w:numId w:val="1"/>
+        </w:numPr>
+      </w:pPr>
+      <w:r>
+        <w:t>PriceBox</w:t>
+      </w:r>
     </w:p>
     <w:p>
       <w:pPr>
@@ -878,6 +893,18 @@
         </w:numPr>
       </w:pPr>
       <w:r>
+        <w:t>itemsOrder</w:t>
+      </w:r>
+    </w:p>
+    <w:p>
+      <w:pPr>
+        <w:pStyle w:val="Prrafodelista"/>
+        <w:numPr>
+          <w:ilvl w:val="2"/>
+          <w:numId w:val="1"/>
+        </w:numPr>
+      </w:pPr>
+      <w:r>
         <w:t>Total</w:t>
       </w:r>
     </w:p>
@@ -909,18 +936,6 @@
       <w:pPr>
         <w:pStyle w:val="Prrafodelista"/>
         <w:numPr>
-          <w:ilvl w:val="2"/>
-          <w:numId w:val="1"/>
-        </w:numPr>
-      </w:pPr>
-      <w:r>
-        <w:t>LastUpdated</w:t>
-      </w:r>
-    </w:p>
-    <w:p>
-      <w:pPr>
-        <w:pStyle w:val="Prrafodelista"/>
-        <w:numPr>
           <w:ilvl w:val="1"/>
           <w:numId w:val="1"/>
         </w:numPr>
@@ -999,6 +1014,18 @@
         </w:numPr>
       </w:pPr>
       <w:r>
+        <w:t>Price</w:t>
+      </w:r>
+    </w:p>
+    <w:p>
+      <w:pPr>
+        <w:pStyle w:val="Prrafodelista"/>
+        <w:numPr>
+          <w:ilvl w:val="2"/>
+          <w:numId w:val="1"/>
+        </w:numPr>
+      </w:pPr>
+      <w:r>
         <w:t>QuantityBox</w:t>
       </w:r>
     </w:p>
@@ -1012,18 +1039,6 @@
       </w:pPr>
       <w:r>
         <w:t>QuantityUnit</w:t>
-      </w:r>
-    </w:p>
-    <w:p>
-      <w:pPr>
-        <w:pStyle w:val="Prrafodelista"/>
-        <w:numPr>
-          <w:ilvl w:val="2"/>
-          <w:numId w:val="1"/>
-        </w:numPr>
-      </w:pPr>
-      <w:r>
-        <w:t>UnitPrice</w:t>
       </w:r>
     </w:p>
     <w:p>

</xml_diff>

<commit_message>
develop: integrate product stock count and product discount when an order is added
</commit_message>
<xml_diff>
--- a/documentacion/docs/Entidades del sistema v1.docx
+++ b/documentacion/docs/Entidades del sistema v1.docx
@@ -494,6 +494,18 @@
         </w:numPr>
       </w:pPr>
       <w:r>
+        <w:t>ProductByBox</w:t>
+      </w:r>
+    </w:p>
+    <w:p>
+      <w:pPr>
+        <w:pStyle w:val="Prrafodelista"/>
+        <w:numPr>
+          <w:ilvl w:val="2"/>
+          <w:numId w:val="1"/>
+        </w:numPr>
+      </w:pPr>
+      <w:r>
         <w:t>Active</w:t>
       </w:r>
     </w:p>
@@ -844,7 +856,6 @@
         </w:numPr>
       </w:pPr>
       <w:r>
-        <w:lastRenderedPageBreak/>
         <w:t>Order</w:t>
       </w:r>
     </w:p>
@@ -1216,6 +1227,7 @@
         </w:numPr>
       </w:pPr>
       <w:r>
+        <w:lastRenderedPageBreak/>
         <w:t>En el MVP se utilizará una sola dirección por usuario, dejando la estructura preparada para múltiples direcciones en fases posteriores.</w:t>
       </w:r>
     </w:p>
@@ -1228,7 +1240,6 @@
         </w:numPr>
       </w:pPr>
       <w:r>
-        <w:lastRenderedPageBreak/>
         <w:t>En el MVP se utilizará un solo role CLIENTE, pero se dejará la estructura preparada para registrar más tipos de role en las fases posteriores</w:t>
       </w:r>
     </w:p>

</xml_diff>

<commit_message>
develop: integrate product stock count and product discount when an o… (#15)
* develop: integrate product stock count and product discount when an order is added

* develop: improvement in obtaining quantities to update an item in a cart
</commit_message>
<xml_diff>
--- a/documentacion/docs/Entidades del sistema v1.docx
+++ b/documentacion/docs/Entidades del sistema v1.docx
@@ -494,6 +494,18 @@
         </w:numPr>
       </w:pPr>
       <w:r>
+        <w:t>ProductByBox</w:t>
+      </w:r>
+    </w:p>
+    <w:p>
+      <w:pPr>
+        <w:pStyle w:val="Prrafodelista"/>
+        <w:numPr>
+          <w:ilvl w:val="2"/>
+          <w:numId w:val="1"/>
+        </w:numPr>
+      </w:pPr>
+      <w:r>
         <w:t>Active</w:t>
       </w:r>
     </w:p>
@@ -844,7 +856,6 @@
         </w:numPr>
       </w:pPr>
       <w:r>
-        <w:lastRenderedPageBreak/>
         <w:t>Order</w:t>
       </w:r>
     </w:p>
@@ -1216,6 +1227,7 @@
         </w:numPr>
       </w:pPr>
       <w:r>
+        <w:lastRenderedPageBreak/>
         <w:t>En el MVP se utilizará una sola dirección por usuario, dejando la estructura preparada para múltiples direcciones en fases posteriores.</w:t>
       </w:r>
     </w:p>
@@ -1228,7 +1240,6 @@
         </w:numPr>
       </w:pPr>
       <w:r>
-        <w:lastRenderedPageBreak/>
         <w:t>En el MVP se utilizará un solo role CLIENTE, pero se dejará la estructura preparada para registrar más tipos de role en las fases posteriores</w:t>
       </w:r>
     </w:p>

</xml_diff>